<commit_message>
Fixed tables for online renderer
</commit_message>
<xml_diff>
--- a/docx/manual/Factorial.docx
+++ b/docx/manual/Factorial.docx
@@ -68,7 +68,19 @@
               <w:rPr>
                 <w:rFonts w:ascii="Cambria Math" w:hAnsi="Cambria Math" w:cs="Courier New"/>
               </w:rPr>
-              <w:t xml:space="preserve"> ∨ number = </w:t>
+              <w:t xml:space="preserve"> ∨ nu</w:t>
+            </w:r>
+            <w:r>
+              <w:rPr>
+                <w:rFonts w:ascii="Cambria Math" w:hAnsi="Cambria Math" w:cs="Courier New"/>
+              </w:rPr>
+              <w:t>m</w:t>
+            </w:r>
+            <w:r>
+              <w:rPr>
+                <w:rFonts w:ascii="Cambria Math" w:hAnsi="Cambria Math" w:cs="Courier New"/>
+              </w:rPr>
+              <w:t xml:space="preserve">ber = </w:t>
             </w:r>
             <w:r>
               <w:rPr>

</xml_diff>